<commit_message>
actualizo README y documentos de descripcion
</commit_message>
<xml_diff>
--- a/SatelitteHub - Como levantar el proyecto.docx
+++ b/SatelitteHub - Como levantar el proyecto.docx
@@ -71,15 +71,7 @@
         <w:spacing w:after="160"/>
       </w:pPr>
       <w:r>
-        <w:t xml:space="preserve">Node.js (cualquier versión reciente está bien, con la 18+ no tuve problemas). Si no lo </w:t>
-      </w:r>
-      <w:proofErr w:type="spellStart"/>
-      <w:r>
-        <w:t>tenés</w:t>
-      </w:r>
-      <w:proofErr w:type="spellEnd"/>
-      <w:r>
-        <w:t>: https://nodejs.org</w:t>
+        <w:t xml:space="preserve">Node.js (cualquier versión reciente está bien, con la 18+ no tuve problemas). </w:t>
       </w:r>
     </w:p>
     <w:p>
@@ -310,19 +302,6 @@
     </w:p>
     <w:p>
       <w:pPr>
-        <w:spacing w:after="160"/>
-      </w:pPr>
-      <w:r>
-        <w:t>Solo instala Express, nada más. Tarda unos segundos.</w:t>
-      </w:r>
-    </w:p>
-    <w:p>
-      <w:pPr>
-        <w:spacing w:after="80"/>
-      </w:pPr>
-    </w:p>
-    <w:p>
-      <w:pPr>
         <w:pStyle w:val="Ttulo2"/>
         <w:spacing w:before="240" w:after="120"/>
       </w:pPr>
@@ -374,7 +353,10 @@
         <w:spacing w:after="160"/>
       </w:pPr>
       <w:r>
-        <w:t>Tiene que decir "servidor en http://localhost:3000". Si aparece ese mensaje, está andando.</w:t>
+        <w:t xml:space="preserve">Iniciar el local host para usarlo de forma local: </w:t>
+      </w:r>
+      <w:r>
+        <w:t>http://localhost:3000</w:t>
       </w:r>
     </w:p>
     <w:p>
@@ -423,302 +405,71 @@
       <w:pPr>
         <w:pStyle w:val="Ttulo1"/>
         <w:spacing w:before="320" w:after="160"/>
-      </w:pPr>
-      <w:r>
         <w:rPr>
           <w:b/>
           <w:bCs/>
           <w:color w:val="2E4057"/>
         </w:rPr>
-        <w:lastRenderedPageBreak/>
-        <w:t xml:space="preserve">El </w:t>
-      </w:r>
-      <w:proofErr w:type="spellStart"/>
-      <w:r>
+      </w:pPr>
+    </w:p>
+    <w:p>
+      <w:pPr>
+        <w:pStyle w:val="Ttulo1"/>
+        <w:spacing w:before="320" w:after="160"/>
         <w:rPr>
           <w:b/>
           <w:bCs/>
           <w:color w:val="2E4057"/>
         </w:rPr>
-        <w:t>workflow</w:t>
-      </w:r>
-      <w:proofErr w:type="spellEnd"/>
+      </w:pPr>
+    </w:p>
+    <w:p>
+      <w:pPr>
+        <w:pStyle w:val="Ttulo1"/>
+        <w:spacing w:before="320" w:after="160"/>
+      </w:pPr>
       <w:r>
         <w:rPr>
           <w:b/>
           <w:bCs/>
           <w:color w:val="2E4057"/>
         </w:rPr>
-        <w:t xml:space="preserve"> de n8n</w:t>
-      </w:r>
-    </w:p>
-    <w:p>
-      <w:pPr>
-        <w:spacing w:after="160"/>
-      </w:pPr>
-      <w:r>
-        <w:t>El archivo n8n-workflow-</w:t>
-      </w:r>
-      <w:proofErr w:type="gramStart"/>
-      <w:r>
-        <w:t>tesacom.json</w:t>
-      </w:r>
-      <w:proofErr w:type="gramEnd"/>
-      <w:r>
-        <w:t xml:space="preserve"> tiene el </w:t>
-      </w:r>
-      <w:proofErr w:type="spellStart"/>
-      <w:r>
-        <w:t>workflow</w:t>
-      </w:r>
-      <w:proofErr w:type="spellEnd"/>
-      <w:r>
-        <w:t xml:space="preserve"> que hace la integración con IBIS. Para importarlo en n8n: </w:t>
-      </w:r>
-      <w:proofErr w:type="spellStart"/>
-      <w:r>
-        <w:t>entrás</w:t>
-      </w:r>
-      <w:proofErr w:type="spellEnd"/>
-      <w:r>
-        <w:t xml:space="preserve"> al n8n, vas a </w:t>
-      </w:r>
-      <w:proofErr w:type="spellStart"/>
-      <w:r>
-        <w:t>Workflows</w:t>
-      </w:r>
-      <w:proofErr w:type="spellEnd"/>
-      <w:r>
-        <w:t xml:space="preserve">, botón de importar (o el menú de los tres puntitos), y </w:t>
-      </w:r>
-      <w:proofErr w:type="spellStart"/>
-      <w:r>
-        <w:t>seleccionás</w:t>
-      </w:r>
-      <w:proofErr w:type="spellEnd"/>
-      <w:r>
-        <w:t xml:space="preserve"> el archivo.</w:t>
-      </w:r>
-    </w:p>
-    <w:p>
-      <w:pPr>
-        <w:spacing w:after="160"/>
-      </w:pPr>
-      <w:r>
+        <w:lastRenderedPageBreak/>
         <w:t xml:space="preserve">El </w:t>
       </w:r>
       <w:proofErr w:type="spellStart"/>
-      <w:r>
-        <w:t>webhook</w:t>
-      </w:r>
-      <w:proofErr w:type="spellEnd"/>
-      <w:r>
-        <w:t xml:space="preserve"> tiene que quedar activo en: http://n8n.tesacom.net:7830/webhook/tesacom-clientes</w:t>
-      </w:r>
-    </w:p>
-    <w:p>
-      <w:pPr>
-        <w:spacing w:after="160"/>
-      </w:pPr>
-      <w:r>
-        <w:t xml:space="preserve">Si el </w:t>
-      </w:r>
-      <w:proofErr w:type="spellStart"/>
-      <w:r>
-        <w:t>workflow</w:t>
-      </w:r>
-      <w:proofErr w:type="spellEnd"/>
-      <w:r>
-        <w:t xml:space="preserve"> no está activo el botón de activar está arriba a la derecha dentro del </w:t>
-      </w:r>
-      <w:proofErr w:type="spellStart"/>
-      <w:r>
-        <w:t>workflow</w:t>
-      </w:r>
-      <w:proofErr w:type="spellEnd"/>
-      <w:r>
-        <w:t xml:space="preserve">, es un </w:t>
-      </w:r>
-      <w:proofErr w:type="spellStart"/>
-      <w:r>
-        <w:t>toggle</w:t>
-      </w:r>
-      <w:proofErr w:type="spellEnd"/>
-      <w:r>
-        <w:t>.</w:t>
-      </w:r>
-    </w:p>
-    <w:p>
-      <w:pPr>
-        <w:spacing w:after="80"/>
-      </w:pPr>
-    </w:p>
-    <w:p>
-      <w:pPr>
-        <w:pStyle w:val="Ttulo1"/>
-        <w:spacing w:before="320" w:after="160"/>
-      </w:pPr>
       <w:r>
         <w:rPr>
           <w:b/>
           <w:bCs/>
           <w:color w:val="2E4057"/>
         </w:rPr>
-        <w:t>Las credenciales de IBIS</w:t>
-      </w:r>
-    </w:p>
-    <w:p>
-      <w:pPr>
-        <w:spacing w:after="160"/>
-      </w:pPr>
-      <w:r>
-        <w:t xml:space="preserve">Están </w:t>
-      </w:r>
-      <w:proofErr w:type="spellStart"/>
-      <w:r>
-        <w:t>hardcodeadas</w:t>
-      </w:r>
-      <w:proofErr w:type="spellEnd"/>
-      <w:r>
-        <w:t xml:space="preserve"> en server.js, arriba del todo en el objeto IBIS_CREDS. Son credenciales OAuth2 (</w:t>
-      </w:r>
-      <w:proofErr w:type="spellStart"/>
-      <w:r>
-        <w:t>client_credentials</w:t>
-      </w:r>
-      <w:proofErr w:type="spellEnd"/>
-      <w:r>
-        <w:t>) una por país. Si en algún momento las rotan desde IBIS hay que cambiarlas ahí.</w:t>
-      </w:r>
-    </w:p>
-    <w:p>
-      <w:pPr>
-        <w:spacing w:after="160"/>
-      </w:pPr>
-      <w:r>
-        <w:t xml:space="preserve">Argentina (ID 3) anda bien. Chile (4) y Perú (6) pueden dar error 401 si las credenciales no están dadas de alta en el </w:t>
-      </w:r>
-      <w:proofErr w:type="spellStart"/>
-      <w:r>
-        <w:t>identity</w:t>
-      </w:r>
-      <w:proofErr w:type="spellEnd"/>
-      <w:r>
-        <w:t xml:space="preserve"> </w:t>
-      </w:r>
-      <w:proofErr w:type="gramStart"/>
-      <w:r>
-        <w:t>server</w:t>
-      </w:r>
-      <w:proofErr w:type="gramEnd"/>
-      <w:r>
-        <w:t xml:space="preserve"> de IBIS. En ese caso hay que </w:t>
-      </w:r>
-      <w:r>
-        <w:t>ver que credenciales tenemos y con que permisos para que funcione</w:t>
-      </w:r>
-    </w:p>
-    <w:p>
-      <w:pPr>
-        <w:spacing w:after="80"/>
-      </w:pPr>
-    </w:p>
-    <w:p>
-      <w:pPr>
-        <w:pStyle w:val="Ttulo1"/>
-        <w:spacing w:before="320" w:after="160"/>
-      </w:pPr>
+        <w:t>workflow</w:t>
+      </w:r>
+      <w:proofErr w:type="spellEnd"/>
       <w:r>
         <w:rPr>
           <w:b/>
           <w:bCs/>
           <w:color w:val="2E4057"/>
         </w:rPr>
-        <w:t>Si algo no anda</w:t>
-      </w:r>
-    </w:p>
-    <w:p>
-      <w:pPr>
-        <w:spacing w:after="160"/>
-      </w:pPr>
-      <w:r>
-        <w:t xml:space="preserve">Lo primero es el botón "Test n8n" que está en la pestaña de Clientes. Abre un panel de </w:t>
-      </w:r>
-      <w:proofErr w:type="spellStart"/>
-      <w:r>
-        <w:t>debug</w:t>
-      </w:r>
-      <w:proofErr w:type="spellEnd"/>
-      <w:r>
-        <w:t xml:space="preserve"> abajo de la pantalla con logs en tiempo real. Ahí se ve si el problema es de conexión con el servidor, con n8n, o con IBIS.</w:t>
-      </w:r>
-    </w:p>
-    <w:p>
-      <w:pPr>
-        <w:spacing w:after="160"/>
-      </w:pPr>
-      <w:r>
-        <w:t>Cosas comunes:</w:t>
-      </w:r>
-    </w:p>
-    <w:p>
-      <w:pPr>
-        <w:spacing w:after="80"/>
-      </w:pPr>
-      <w:r>
-        <w:t>"</w:t>
-      </w:r>
-      <w:proofErr w:type="spellStart"/>
-      <w:r>
-        <w:t>Failed</w:t>
-      </w:r>
-      <w:proofErr w:type="spellEnd"/>
-      <w:r>
-        <w:t xml:space="preserve"> </w:t>
-      </w:r>
-      <w:proofErr w:type="spellStart"/>
-      <w:r>
-        <w:t>to</w:t>
-      </w:r>
-      <w:proofErr w:type="spellEnd"/>
-      <w:r>
-        <w:t xml:space="preserve"> </w:t>
-      </w:r>
-      <w:proofErr w:type="spellStart"/>
-      <w:r>
-        <w:t>fetch</w:t>
-      </w:r>
-      <w:proofErr w:type="spellEnd"/>
-      <w:r>
-        <w:t xml:space="preserve">" </w:t>
-      </w:r>
-      <w:r>
-        <w:t>-&gt;</w:t>
-      </w:r>
-      <w:r>
-        <w:t xml:space="preserve"> el server.js no está corriendo, o lo cerraron.</w:t>
-      </w:r>
-    </w:p>
-    <w:p>
-      <w:pPr>
-        <w:spacing w:after="80"/>
-      </w:pPr>
-      <w:r>
-        <w:t xml:space="preserve">Error 502 </w:t>
-      </w:r>
-      <w:r>
-        <w:t>-&gt;</w:t>
-      </w:r>
-      <w:r>
-        <w:t xml:space="preserve"> el servidor </w:t>
+        <w:t xml:space="preserve"> de n8n</w:t>
+      </w:r>
+    </w:p>
+    <w:p>
+      <w:pPr>
+        <w:spacing w:after="160"/>
+      </w:pPr>
+      <w:r>
+        <w:t>El archivo n8n-workflow-</w:t>
       </w:r>
       <w:proofErr w:type="gramStart"/>
       <w:r>
-        <w:t>está</w:t>
+        <w:t>tesacom.json</w:t>
       </w:r>
       <w:proofErr w:type="gramEnd"/>
       <w:r>
-        <w:t xml:space="preserve"> pero n8n no responde. Verificar que n8n esté activo y el </w:t>
+        <w:t xml:space="preserve"> tiene el </w:t>
       </w:r>
       <w:proofErr w:type="spellStart"/>
       <w:r>
@@ -726,40 +477,96 @@
       </w:r>
       <w:proofErr w:type="spellEnd"/>
       <w:r>
-        <w:t xml:space="preserve"> esté activado.</w:t>
-      </w:r>
-    </w:p>
-    <w:p>
-      <w:pPr>
-        <w:spacing w:after="80"/>
-      </w:pPr>
-      <w:r>
-        <w:t xml:space="preserve">Error 401 desde IBIS </w:t>
-      </w:r>
-      <w:r>
-        <w:t>-&gt;</w:t>
-      </w:r>
-      <w:r>
-        <w:t xml:space="preserve"> problema con las credenciales OAuth, ver la sección anterior.</w:t>
-      </w:r>
-    </w:p>
-    <w:p>
-      <w:pPr>
-        <w:spacing w:after="160"/>
-      </w:pPr>
-      <w:proofErr w:type="spellStart"/>
-      <w:r>
-        <w:t>Timeout</w:t>
-      </w:r>
-      <w:proofErr w:type="spellEnd"/>
-      <w:r>
-        <w:t xml:space="preserve"> (90 segundos) </w:t>
-      </w:r>
-      <w:r>
-        <w:t>-&gt;</w:t>
-      </w:r>
-      <w:r>
-        <w:t xml:space="preserve"> IBIS tardó demasiado. En ese caso puede que igual haya creado el cliente. Hay un botón "Verificar en IBIS" que sale en ese error para chequear por CUIT/RUC.</w:t>
+        <w:t xml:space="preserve"> que hace la integración con IBIS. Para importarlo en n8n: </w:t>
+      </w:r>
+      <w:proofErr w:type="spellStart"/>
+      <w:r>
+        <w:t>entrás</w:t>
+      </w:r>
+      <w:proofErr w:type="spellEnd"/>
+      <w:r>
+        <w:t xml:space="preserve"> al n8n, vas a </w:t>
+      </w:r>
+      <w:proofErr w:type="spellStart"/>
+      <w:r>
+        <w:t>Workflows</w:t>
+      </w:r>
+      <w:proofErr w:type="spellEnd"/>
+      <w:r>
+        <w:t xml:space="preserve">, botón de importar (o el menú de los tres puntitos), y </w:t>
+      </w:r>
+      <w:proofErr w:type="spellStart"/>
+      <w:r>
+        <w:t>seleccionás</w:t>
+      </w:r>
+      <w:proofErr w:type="spellEnd"/>
+      <w:r>
+        <w:t xml:space="preserve"> el archivo.</w:t>
+      </w:r>
+      <w:r>
+        <w:t xml:space="preserve"> (Este uso como referencia el que me pasó Oscar para las credenciales que </w:t>
+      </w:r>
+      <w:proofErr w:type="gramStart"/>
+      <w:r>
+        <w:t>usa</w:t>
+      </w:r>
+      <w:proofErr w:type="gramEnd"/>
+      <w:r>
+        <w:t xml:space="preserve"> pero yo lo modifique para hacer la carga de usuarios)</w:t>
+      </w:r>
+    </w:p>
+    <w:p>
+      <w:pPr>
+        <w:spacing w:after="160"/>
+      </w:pPr>
+      <w:r>
+        <w:t xml:space="preserve">El </w:t>
+      </w:r>
+      <w:proofErr w:type="spellStart"/>
+      <w:r>
+        <w:t>webhook</w:t>
+      </w:r>
+      <w:proofErr w:type="spellEnd"/>
+      <w:r>
+        <w:t xml:space="preserve"> tiene que quedar activo en: http://n8n.tesacom.net:7830/webhook/tesacom-clientes</w:t>
+      </w:r>
+    </w:p>
+    <w:p>
+      <w:pPr>
+        <w:spacing w:after="160"/>
+      </w:pPr>
+      <w:r>
+        <w:t xml:space="preserve">Si el </w:t>
+      </w:r>
+      <w:proofErr w:type="spellStart"/>
+      <w:r>
+        <w:t>workflow</w:t>
+      </w:r>
+      <w:proofErr w:type="spellEnd"/>
+      <w:r>
+        <w:t xml:space="preserve"> no está activo</w:t>
+      </w:r>
+      <w:r>
+        <w:t>,</w:t>
+      </w:r>
+      <w:r>
+        <w:t xml:space="preserve"> el botón de activar está arriba a la derecha dentro del </w:t>
+      </w:r>
+      <w:proofErr w:type="spellStart"/>
+      <w:r>
+        <w:t>workflow</w:t>
+      </w:r>
+      <w:proofErr w:type="spellEnd"/>
+      <w:r>
+        <w:t xml:space="preserve">, es un </w:t>
+      </w:r>
+      <w:proofErr w:type="spellStart"/>
+      <w:r>
+        <w:t>toggle</w:t>
+      </w:r>
+      <w:proofErr w:type="spellEnd"/>
+      <w:r>
+        <w:t>.</w:t>
       </w:r>
     </w:p>
     <w:p>
@@ -771,36 +578,249 @@
       <w:pPr>
         <w:pStyle w:val="Ttulo1"/>
         <w:spacing w:before="320" w:after="160"/>
+      </w:pPr>
+      <w:r>
         <w:rPr>
           <w:b/>
           <w:bCs/>
           <w:color w:val="2E4057"/>
         </w:rPr>
+        <w:t>Las credenciales de IBIS</w:t>
+      </w:r>
+    </w:p>
+    <w:p>
+      <w:pPr>
+        <w:spacing w:after="160"/>
+      </w:pPr>
+      <w:r>
+        <w:t xml:space="preserve">Están </w:t>
+      </w:r>
+      <w:proofErr w:type="spellStart"/>
+      <w:r>
+        <w:t>hardcodeadas</w:t>
+      </w:r>
+      <w:proofErr w:type="spellEnd"/>
+      <w:r>
+        <w:t xml:space="preserve"> en server.js, arriba del todo en el objeto IBIS_CREDS. Son credenciales OAuth2 (</w:t>
+      </w:r>
+      <w:proofErr w:type="spellStart"/>
+      <w:r>
+        <w:t>client_credentials</w:t>
+      </w:r>
+      <w:proofErr w:type="spellEnd"/>
+      <w:r>
+        <w:t>) una por país. Si en algún momento las rotan desde IBIS hay que cambiarlas ahí.</w:t>
+      </w:r>
+    </w:p>
+    <w:p>
+      <w:pPr>
+        <w:spacing w:after="160"/>
+      </w:pPr>
+      <w:r>
+        <w:t xml:space="preserve">Argentina (ID 3) anda bien. Chile (4) y Perú (6) pueden dar error 401 si las credenciales no están dadas de alta en el </w:t>
+      </w:r>
+      <w:proofErr w:type="spellStart"/>
+      <w:r>
+        <w:t>identity</w:t>
+      </w:r>
+      <w:proofErr w:type="spellEnd"/>
+      <w:r>
+        <w:t xml:space="preserve"> </w:t>
+      </w:r>
+      <w:proofErr w:type="gramStart"/>
+      <w:r>
+        <w:t>server</w:t>
+      </w:r>
+      <w:proofErr w:type="gramEnd"/>
+      <w:r>
+        <w:t xml:space="preserve"> de IBIS. En ese caso hay que </w:t>
+      </w:r>
+      <w:r>
+        <w:t>ver que credenciales tenemos y con que permisos para que funcione</w:t>
+      </w:r>
+    </w:p>
+    <w:p>
+      <w:pPr>
+        <w:spacing w:after="80"/>
       </w:pPr>
     </w:p>
     <w:p>
       <w:pPr>
         <w:pStyle w:val="Ttulo1"/>
         <w:spacing w:before="320" w:after="160"/>
+      </w:pPr>
+      <w:r>
         <w:rPr>
           <w:b/>
           <w:bCs/>
           <w:color w:val="2E4057"/>
         </w:rPr>
+        <w:t>Si algo no anda</w:t>
+      </w:r>
+    </w:p>
+    <w:p>
+      <w:pPr>
+        <w:spacing w:after="160"/>
+      </w:pPr>
+      <w:r>
+        <w:t xml:space="preserve">Lo primero es el botón "Test n8n" que está en la pestaña de Clientes. Abre un panel de </w:t>
+      </w:r>
+      <w:proofErr w:type="spellStart"/>
+      <w:r>
+        <w:t>debug</w:t>
+      </w:r>
+      <w:proofErr w:type="spellEnd"/>
+      <w:r>
+        <w:t xml:space="preserve"> abajo de la pantalla con logs en tiempo real. Ahí se ve si el problema es de conexión con el servidor, con n8n, o con IBIS.</w:t>
+      </w:r>
+    </w:p>
+    <w:p>
+      <w:pPr>
+        <w:spacing w:after="160"/>
+      </w:pPr>
+      <w:r>
+        <w:t>Cosas comunes:</w:t>
+      </w:r>
+    </w:p>
+    <w:p>
+      <w:pPr>
+        <w:spacing w:after="80"/>
+      </w:pPr>
+      <w:r>
+        <w:t>"</w:t>
+      </w:r>
+      <w:proofErr w:type="spellStart"/>
+      <w:r>
+        <w:t>Failed</w:t>
+      </w:r>
+      <w:proofErr w:type="spellEnd"/>
+      <w:r>
+        <w:t xml:space="preserve"> </w:t>
+      </w:r>
+      <w:proofErr w:type="spellStart"/>
+      <w:r>
+        <w:t>to</w:t>
+      </w:r>
+      <w:proofErr w:type="spellEnd"/>
+      <w:r>
+        <w:t xml:space="preserve"> </w:t>
+      </w:r>
+      <w:proofErr w:type="spellStart"/>
+      <w:r>
+        <w:t>fetch</w:t>
+      </w:r>
+      <w:proofErr w:type="spellEnd"/>
+      <w:r>
+        <w:t xml:space="preserve">" </w:t>
+      </w:r>
+      <w:r>
+        <w:t>-&gt;</w:t>
+      </w:r>
+      <w:r>
+        <w:t xml:space="preserve"> el server.js no está corriendo, o lo cerraron.</w:t>
+      </w:r>
+    </w:p>
+    <w:p>
+      <w:pPr>
+        <w:spacing w:after="80"/>
+      </w:pPr>
+      <w:r>
+        <w:t xml:space="preserve">Error 502 </w:t>
+      </w:r>
+      <w:r>
+        <w:t>-&gt;</w:t>
+      </w:r>
+      <w:r>
+        <w:t xml:space="preserve"> el servidor </w:t>
+      </w:r>
+      <w:proofErr w:type="gramStart"/>
+      <w:r>
+        <w:t>está</w:t>
+      </w:r>
+      <w:proofErr w:type="gramEnd"/>
+      <w:r>
+        <w:t xml:space="preserve"> pero n8n no responde. Verificar que n8n esté activo y el </w:t>
+      </w:r>
+      <w:proofErr w:type="spellStart"/>
+      <w:r>
+        <w:t>workflow</w:t>
+      </w:r>
+      <w:proofErr w:type="spellEnd"/>
+      <w:r>
+        <w:t xml:space="preserve"> esté activado.</w:t>
+      </w:r>
+    </w:p>
+    <w:p>
+      <w:pPr>
+        <w:spacing w:after="80"/>
+      </w:pPr>
+      <w:r>
+        <w:t xml:space="preserve">Error 401 desde IBIS </w:t>
+      </w:r>
+      <w:r>
+        <w:t>-&gt;</w:t>
+      </w:r>
+      <w:r>
+        <w:t xml:space="preserve"> problema con las credenciales OAuth, ver la sección anterior.</w:t>
+      </w:r>
+    </w:p>
+    <w:p>
+      <w:pPr>
+        <w:spacing w:after="160"/>
+      </w:pPr>
+      <w:proofErr w:type="spellStart"/>
+      <w:r>
+        <w:t>Timeout</w:t>
+      </w:r>
+      <w:proofErr w:type="spellEnd"/>
+      <w:r>
+        <w:t xml:space="preserve"> (90 segundos) </w:t>
+      </w:r>
+      <w:r>
+        <w:t>-&gt;</w:t>
+      </w:r>
+      <w:r>
+        <w:t xml:space="preserve"> IBIS tardó demasiado. En ese caso puede que igual haya creado el cliente. Hay un botón "Verificar en IBIS" que sale en ese error para chequear por CUIT/RUC.</w:t>
+      </w:r>
+    </w:p>
+    <w:p>
+      <w:pPr>
+        <w:spacing w:after="80"/>
       </w:pPr>
     </w:p>
     <w:p>
       <w:pPr>
         <w:pStyle w:val="Ttulo1"/>
         <w:spacing w:before="320" w:after="160"/>
-      </w:pPr>
-      <w:r>
         <w:rPr>
           <w:b/>
           <w:bCs/>
           <w:color w:val="2E4057"/>
         </w:rPr>
-        <w:lastRenderedPageBreak/>
+      </w:pPr>
+    </w:p>
+    <w:p>
+      <w:pPr>
+        <w:pStyle w:val="Ttulo1"/>
+        <w:spacing w:before="320" w:after="160"/>
+        <w:rPr>
+          <w:b/>
+          <w:bCs/>
+          <w:color w:val="2E4057"/>
+        </w:rPr>
+      </w:pPr>
+    </w:p>
+    <w:p>
+      <w:pPr>
+        <w:pStyle w:val="Ttulo1"/>
+        <w:spacing w:before="320" w:after="160"/>
+      </w:pPr>
+      <w:r>
+        <w:rPr>
+          <w:b/>
+          <w:bCs/>
+          <w:color w:val="2E4057"/>
+        </w:rPr>
         <w:t>Estructura del proyecto</w:t>
       </w:r>
     </w:p>
@@ -1059,9 +1079,13 @@
         <w:spacing w:after="160"/>
       </w:pPr>
       <w:r>
+        <w:lastRenderedPageBreak/>
         <w:br/>
       </w:r>
       <w:r>
+        <w:rPr>
+          <w:noProof/>
+        </w:rPr>
         <w:drawing>
           <wp:inline distT="0" distB="0" distL="0" distR="0" wp14:anchorId="6B5E5AE6" wp14:editId="0B8F439E">
             <wp:extent cx="5943600" cy="2899410"/>
@@ -1105,7 +1129,6 @@
         <w:br/>
       </w:r>
       <w:r>
-        <w:lastRenderedPageBreak/>
         <w:t xml:space="preserve">(Izquierda) </w:t>
       </w:r>
       <w:r>
@@ -1272,43 +1295,6 @@
       </w:r>
       <w:r>
         <w:br/>
-      </w:r>
-      <w:r>
-        <w:drawing>
-          <wp:inline distT="0" distB="0" distL="0" distR="0" wp14:anchorId="7BF9A25D" wp14:editId="5104A0D4">
-            <wp:extent cx="5943600" cy="2910205"/>
-            <wp:effectExtent l="0" t="0" r="0" b="4445"/>
-            <wp:docPr id="1229247796" name="Imagen 1"/>
-            <wp:cNvGraphicFramePr>
-              <a:graphicFrameLocks xmlns:a="http://schemas.openxmlformats.org/drawingml/2006/main" noChangeAspect="1"/>
-            </wp:cNvGraphicFramePr>
-            <a:graphic xmlns:a="http://schemas.openxmlformats.org/drawingml/2006/main">
-              <a:graphicData uri="http://schemas.openxmlformats.org/drawingml/2006/picture">
-                <pic:pic xmlns:pic="http://schemas.openxmlformats.org/drawingml/2006/picture">
-                  <pic:nvPicPr>
-                    <pic:cNvPr id="1229247796" name=""/>
-                    <pic:cNvPicPr/>
-                  </pic:nvPicPr>
-                  <pic:blipFill>
-                    <a:blip r:embed="rId6"/>
-                    <a:stretch>
-                      <a:fillRect/>
-                    </a:stretch>
-                  </pic:blipFill>
-                  <pic:spPr>
-                    <a:xfrm>
-                      <a:off x="0" y="0"/>
-                      <a:ext cx="5943600" cy="2910205"/>
-                    </a:xfrm>
-                    <a:prstGeom prst="rect">
-                      <a:avLst/>
-                    </a:prstGeom>
-                  </pic:spPr>
-                </pic:pic>
-              </a:graphicData>
-            </a:graphic>
-          </wp:inline>
-        </w:drawing>
       </w:r>
     </w:p>
     <w:sectPr>
@@ -1897,6 +1883,7 @@
   <w:style w:type="character" w:default="1" w:styleId="Fuentedeprrafopredeter">
     <w:name w:val="Default Paragraph Font"/>
     <w:uiPriority w:val="1"/>
+    <w:semiHidden/>
     <w:unhideWhenUsed/>
   </w:style>
   <w:style w:type="table" w:default="1" w:styleId="Tablanormal">

</xml_diff>